<commit_message>
feat(legal): unificar marca a "ArriendoSeguro" + identidad LOTIC (persona natural, NIT) + fix build
- Marca unificada a "ArriendoSeguro" (una palabra) en contrato, inventario, pagos,
  marketing y consentimiento. Nueva version de consentimiento CONSENT-2026.2
  (2026-08-11) que exige reaceptacion; 2026.1 queda como historico.
- Responsable = LOTIC (marca tecnologica sombrilla), operada por persona natural
  comerciante, NIT 71.217.228 (digito de verificacion por asignar), Medellin;
  reflejado en aviso, politica, terminos y acerca-de.
- Fix: auditEvent en /api/cuenta/mis-datos (PUT rectificacion) pasaba un arreglo;
  ahora string (corrige type error que rompia el build).

Co-Authored-By: Claude Opus 4.8 <noreply@anthropic.com>
</commit_message>
<xml_diff>
--- a/docs/revision-abogado/0-PAQUETE-COMPLETO-revision-abogado.docx
+++ b/docs/revision-abogado/0-PAQUETE-COMPLETO-revision-abogado.docx
@@ -144,7 +144,7 @@
           <w:sz w:val="19"/>
           <w:szCs w:val="19"/>
         </w:rPr>
-        <w:t xml:space="preserve">Al final de la Parte 3 hay una sección «Puntos que conviene confirmar con el abogado» con las decisiones de identidad y alcance que requieren su visto bueno (identidad societaria de LOTIC, grafía de la marca, requerimiento de cobro, aplicación de la Ley 1266, alcance de la firma electrónica y la cláusula «Otra»). Recomendamos empezar la lectura por esa sección para enfocar la revisión.</w:t>
+        <w:t xml:space="preserve">Identidad del responsable: LOTIC, marca tecnológica sombrilla operada por persona natural comerciante en Colombia (NIT 71.217.228, dígito de verificación por asignar), domicilio Medellín; ArriendoSeguro es uno de sus productos. Al final de la Parte 3 hay una sección «Puntos que conviene confirmar con el abogado» (identidad del responsable y traspaso futuro a sociedad, requerimiento de cobro, aplicación de la Ley 1266, alcance de la firma electrónica y la cláusula «Otra»). Recomendamos empezar la lectura por esa sección para enfocar la revisión.</w:t>
       </w:r>
     </w:p>
     <w:p>
@@ -530,7 +530,7 @@
           <w:b w:val="false"/>
           <w:bCs w:val="false"/>
         </w:rPr>
-        <w:t xml:space="preserve">El incremento no podrá superar el porcentaje legalmente permitido para el periodo correspondiente. Arriendo Seguro podrá servir como herramienta de cálculo y registro del reajuste, sin que ello sustituya la responsabilidad de las partes de verificar la normatividad vigente.</w:t>
+        <w:t xml:space="preserve">El incremento no podrá superar el porcentaje legalmente permitido para el periodo correspondiente. ArriendoSeguro podrá servir como herramienta de cálculo y registro del reajuste, sin que ello sustituya la responsabilidad de las partes de verificar la normatividad vigente.</w:t>
       </w:r>
     </w:p>
     <w:p>
@@ -572,20 +572,20 @@
           <w:b w:val="false"/>
           <w:bCs w:val="false"/>
         </w:rPr>
-        <w:t xml:space="preserve">EL ARRENDADOR deberá entregar o permitir constancia del pago recibido. Cuando las partes usen Arriendo Seguro, podrán registrar los pagos realizados dentro de la plataforma como soporte documental.</w:t>
-      </w:r>
-    </w:p>
-    <w:p>
-      <w:pPr>
-        <w:spacing w:after="100"/>
-        <w:jc w:val="both"/>
-      </w:pPr>
-      <w:r>
-        <w:rPr>
-          <w:b w:val="false"/>
-          <w:bCs w:val="false"/>
-        </w:rPr>
-        <w:t xml:space="preserve">Las partes reconocen que Arriendo Seguro no recauda dinero, no administra recursos, no actúa como intermediario financiero y no garantiza el pago del canon.</w:t>
+        <w:t xml:space="preserve">EL ARRENDADOR deberá entregar o permitir constancia del pago recibido. Cuando las partes usen ArriendoSeguro, podrán registrar los pagos realizados dentro de la plataforma como soporte documental.</w:t>
+      </w:r>
+    </w:p>
+    <w:p>
+      <w:pPr>
+        <w:spacing w:after="100"/>
+        <w:jc w:val="both"/>
+      </w:pPr>
+      <w:r>
+        <w:rPr>
+          <w:b w:val="false"/>
+          <w:bCs w:val="false"/>
+        </w:rPr>
+        <w:t xml:space="preserve">Las partes reconocen que ArriendoSeguro no recauda dinero, no administra recursos, no actúa como intermediario financiero y no garantiza el pago del canon.</w:t>
       </w:r>
     </w:p>
     <w:p>
@@ -1163,7 +1163,7 @@
           <w:b w:val="false"/>
           <w:bCs w:val="false"/>
         </w:rPr>
-        <w:t xml:space="preserve">Las partes autorizan el tratamiento de sus datos personales por parte de la plataforma Arriendo Seguro para las finalidades relacionadas con creación, gestión, firma, trazabilidad, conservación documental y soporte del contrato.</w:t>
+        <w:t xml:space="preserve">Las partes autorizan el tratamiento de sus datos personales por parte de la plataforma ArriendoSeguro para las finalidades relacionadas con creación, gestión, firma, trazabilidad, conservación documental y soporte del contrato.</w:t>
       </w:r>
     </w:p>
     <w:p>
@@ -1518,20 +1518,20 @@
           <w:sz w:val="24"/>
           <w:szCs w:val="24"/>
         </w:rPr>
-        <w:t xml:space="preserve">VIGÉSIMA. USO DE LA PLATAFORMA ARRIENDO SEGURO</w:t>
-      </w:r>
-    </w:p>
-    <w:p>
-      <w:pPr>
-        <w:spacing w:after="100"/>
-        <w:jc w:val="both"/>
-      </w:pPr>
-      <w:r>
-        <w:rPr>
-          <w:b w:val="false"/>
-          <w:bCs w:val="false"/>
-        </w:rPr>
-        <w:t xml:space="preserve">Arriendo Seguro actúa como herramienta tecnológica de apoyo documental. No actúa como inmobiliaria, aseguradora, entidad financiera, abogado ni garante del cumplimiento.</w:t>
+        <w:t xml:space="preserve">VIGÉSIMA. USO DE LA PLATAFORMA ARRIENDOSEGURO</w:t>
+      </w:r>
+    </w:p>
+    <w:p>
+      <w:pPr>
+        <w:spacing w:after="100"/>
+        <w:jc w:val="both"/>
+      </w:pPr>
+      <w:r>
+        <w:rPr>
+          <w:b w:val="false"/>
+          <w:bCs w:val="false"/>
+        </w:rPr>
+        <w:t xml:space="preserve">ArriendoSeguro actúa como herramienta tecnológica de apoyo documental. No actúa como inmobiliaria, aseguradora, entidad financiera, abogado ni garante del cumplimiento.</w:t>
       </w:r>
     </w:p>
     <w:p>
@@ -5144,7 +5144,7 @@
           <w:b w:val="false"/>
           <w:bCs w:val="false"/>
         </w:rPr>
-        <w:t xml:space="preserve">El responsable del tratamiento de los datos personales tratados a través de la plataforma ArriendoSeguro es LOTIC, operador de la plataforma, con domicilio en Medellín (Colombia). El canal de atención y de ejercicio de derechos de habeas data es contacto@arriendoseguro.app, sin perjuicio de los demás canales publicados en la aplicación.</w:t>
+        <w:t xml:space="preserve">El responsable del tratamiento de los datos personales tratados a través de la plataforma ArriendoSeguro es LOTIC, marca tecnológica que agrupa los productos de software de su titular (entre ellos ArriendoSeguro), operada en Colombia por una persona natural comerciante identificada con NIT 71.217.228 (dígito de verificación por asignar), con domicilio en Medellín. El canal de atención y de ejercicio de derechos de habeas data es contacto@arriendoseguro.app, sin perjuicio de los demás canales publicados en la aplicación.</w:t>
       </w:r>
     </w:p>
     <w:p>
@@ -5822,7 +5822,7 @@
           <w:sz w:val="18"/>
           <w:szCs w:val="18"/>
         </w:rPr>
-        <w:t xml:space="preserve">Documento AVISO-PRIV-2026.2 · Publicado 2026-08-11 · Consentimiento de registro vigente: CONSENT-2026.1 (2026-05-11).</w:t>
+        <w:t xml:space="preserve">Documento AVISO-PRIV-2026.2 · Publicado 2026-08-11 · Consentimiento de registro vigente: CONSENT-2026.2 (2026-08-11).</w:t>
       </w:r>
     </w:p>
     <w:p>
@@ -5851,7 +5851,7 @@
           <w:b w:val="false"/>
           <w:bCs w:val="false"/>
         </w:rPr>
-        <w:t xml:space="preserve">El responsable del tratamiento de datos personales a través de la plataforma es LOTIC, operador de la plataforma ArriendoSeguro, con domicilio en Medellín (Colombia), en adelante «nosotros» o «la plataforma», según corresponda al contexto. Canal de atención y de ejercicio de derechos de habeas data: contacto@arriendoseguro.app.</w:t>
+        <w:t xml:space="preserve">El responsable del tratamiento de datos personales a través de la plataforma es LOTIC, marca tecnológica que agrupa los productos de software de su titular —entre ellos ArriendoSeguro—, operada en Colombia por una persona natural comerciante identificada con NIT 71.217.228 (dígito de verificación por asignar), con domicilio en Medellín, en adelante «nosotros» o «la plataforma», según corresponda al contexto. Canal de atención y de ejercicio de derechos de habeas data: contacto@arriendoseguro.app.</w:t>
       </w:r>
     </w:p>
     <w:p>
@@ -7198,7 +7198,7 @@
           <w:sz w:val="28"/>
           <w:szCs w:val="28"/>
         </w:rPr>
-        <w:t xml:space="preserve">8. Texto del consentimiento de registro (CONSENT-2026.1)</w:t>
+        <w:t xml:space="preserve">8. Texto del consentimiento de registro (CONSENT-2026.2)</w:t>
       </w:r>
     </w:p>
     <w:p>
@@ -7211,7 +7211,7 @@
           <w:sz w:val="18"/>
           <w:szCs w:val="18"/>
         </w:rPr>
-        <w:t xml:space="preserve">Es el texto que el usuario acepta al registrarse / antes de crear un contrato. Publicado 2026-05-11.</w:t>
+        <w:t xml:space="preserve">Es el texto que el usuario acepta al registrarse / antes de crear un contrato. Publicado 2026-08-11.</w:t>
       </w:r>
     </w:p>
     <w:p>
@@ -7240,7 +7240,7 @@
           <w:b w:val="false"/>
           <w:bCs w:val="false"/>
         </w:rPr>
-        <w:t xml:space="preserve">«He leído y acepto el Aviso de privacidad y autorizo el tratamiento de mis datos personales por parte de Arriendo Seguro, conforme a la Ley 1581 de 2012.»</w:t>
+        <w:t xml:space="preserve">«He leído y acepto el Aviso de privacidad y autorizo el tratamiento de mis datos personales por parte de ArriendoSeguro, conforme a la Ley 1581 de 2012.»</w:t>
       </w:r>
     </w:p>
     <w:p>
@@ -7269,7 +7269,7 @@
           <w:b w:val="false"/>
           <w:bCs w:val="false"/>
         </w:rPr>
-        <w:t xml:space="preserve">«Acepto que Arriendo Seguro trate mis datos personales con las siguientes finalidades:</w:t>
+        <w:t xml:space="preserve">«Acepto que ArriendoSeguro trate mis datos personales con las siguientes finalidades:</w:t>
       </w:r>
     </w:p>
     <w:p>
@@ -7424,14 +7424,14 @@
           <w:b/>
           <w:bCs/>
         </w:rPr>
-        <w:t xml:space="preserve">Identidad societaria de LOTIC.</w:t>
-      </w:r>
-      <w:r>
-        <w:rPr>
-          <w:b w:val="false"/>
-          <w:bCs w:val="false"/>
-        </w:rPr>
-        <w:t xml:space="preserve"> Hoy se identifica a LOTIC como responsable/operador con domicilio en Medellín y canal contacto@arriendoseguro.app. Falta definir si se publica razón social exacta y NIT (y dirección de notificación judicial). Si LOTIC está constituida, indícanos esos datos para insertarlos; el abogado confirma si son obligatorios para el aviso.</w:t>
+        <w:t xml:space="preserve">Identidad del responsable (LOTIC).</w:t>
+      </w:r>
+      <w:r>
+        <w:rPr>
+          <w:b w:val="false"/>
+          <w:bCs w:val="false"/>
+        </w:rPr>
+        <w:t xml:space="preserve"> LOTIC es la marca tecnológica sombrilla que agrupa los productos de software de su titular (entre ellos ArriendoSeguro). Hoy opera como PERSONA NATURAL COMERCIANTE en Colombia, con NIT 71.217.228 (el dígito de verificación se completará al formalizar la matrícula mercantil) y domicilio en Medellín; a futuro migrará a persona jurídica. Puntos para el abogado: (a) confirmar la redacción del responsable como persona natural comerciante con nombre comercial LOTIC; (b) si conviene incluir el nombre completo del titular y/o la dirección de notificación judicial además del NIT; (c) cómo dejar previsto el traspaso a la sociedad cuando se constituya, para no tener que reaceptar consentimientos de nuevo.</w:t>
       </w:r>
     </w:p>
     <w:p>
@@ -7448,14 +7448,14 @@
           <w:b/>
           <w:bCs/>
         </w:rPr>
-        <w:t xml:space="preserve">Grafía de la marca.</w:t>
-      </w:r>
-      <w:r>
-        <w:rPr>
-          <w:b w:val="false"/>
-          <w:bCs w:val="false"/>
-        </w:rPr>
-        <w:t xml:space="preserve"> La interfaz y las políticas usan «ArriendoSeguro» (una palabra), mientras que el contrato y el texto de consentimiento usan «Arriendo Seguro» (dos palabras). Conviene unificar; cambiar el consentimiento implica publicar una nueva versión y pedir reaceptación, por eso se dejó como está a la espera de tu decisión.</w:t>
+        <w:t xml:space="preserve">Grafía de la marca (ya unificada).</w:t>
+      </w:r>
+      <w:r>
+        <w:rPr>
+          <w:b w:val="false"/>
+          <w:bCs w:val="false"/>
+        </w:rPr>
+        <w:t xml:space="preserve"> Todo el producto (web, contrato, inventario y consentimiento) usa ahora «ArriendoSeguro» (una palabra), igual que el logo y el dominio. Por el cambio de texto se publicó una nueva versión del consentimiento (CONSENT-2026.2, 11-ago-2026) y los usuarios ya registrados la re-aceptan una vez antes de crear un nuevo contrato.</w:t>
       </w:r>
     </w:p>
     <w:p>

</xml_diff>

<commit_message>
docs(legal): regenerar paquete v2 con observaciones del abogado (Ley 820)
</commit_message>
<xml_diff>
--- a/docs/revision-abogado/0-PAQUETE-COMPLETO-revision-abogado.docx
+++ b/docs/revision-abogado/0-PAQUETE-COMPLETO-revision-abogado.docx
@@ -29,7 +29,7 @@
           <w:sz w:val="18"/>
           <w:szCs w:val="18"/>
         </w:rPr>
-        <w:t xml:space="preserve">ArriendoSeguro — un producto de LOTIC · Documento único y completo para revisión legal · 11 de agosto de 2026</w:t>
+        <w:t xml:space="preserve">ArriendoSeguro — un producto de LOTIC · Documento único y completo para revisión legal · Versión 2 (incorpora las observaciones de la revisión jurídica sobre la Ley 820: prórroga art. 6, reajuste art. 20, causales de terminación art. 22 y 24, calidad del arrendador, codeudor en el cuerpo, evaluación como facultad voluntaria) · 13 de agosto de 2026</w:t>
       </w:r>
     </w:p>
     <w:p>
@@ -287,7 +287,7 @@
           <w:sz w:val="18"/>
           <w:szCs w:val="18"/>
         </w:rPr>
-        <w:t xml:space="preserve">Nota: cada comparecencia se arma con los datos de la persona en este formato: «[Nombre], mayor de edad, identificado(a) con [tipo y número de documento], domiciliado(a) en [ciudad], con correo electrónico [correo], teléfono [teléfono] y dirección de notificación [dirección], quien para efectos del presente contrato se denominará EL ARRENDADOR / EL ARRENDATARIO / EL CODEUDOR SOLIDARIO».</w:t>
+        <w:t xml:space="preserve">Nota: cada comparecencia se arma con los datos de la persona en este formato: «[Nombre], mayor de edad, identificado(a) con [tipo y número de documento], domiciliado(a) en [ciudad], con correo electrónico [correo], teléfono [teléfono] y dirección de notificación [dirección]…». El ARRENDADOR además declara actuar en su calidad de propietario del inmueble —o de poseedor o apoderado con facultad para arrendarlo, según los documentos que se anexen—, y cada parte se denomina EL ARRENDADOR / EL ARRENDATARIO / EL CODEUDOR SOLIDARIO.</w:t>
       </w:r>
     </w:p>
     <w:p>
@@ -384,7 +384,7 @@
           <w:b w:val="false"/>
           <w:bCs w:val="false"/>
         </w:rPr>
-        <w:t xml:space="preserve">EL ARRENDATARIO se obliga a destinar el inmueble exclusivamente para vivienda propia y/o de su grupo autorizado, sin que pueda darle destinación comercial, industrial, turística, hotelera, subarrendarlo, cederlo o permitir su ocupación por terceros no autorizados, salvo autorización previa, expresa y escrita de EL ARRENDADOR.</w:t>
+        <w:t xml:space="preserve">EL ARRENDATARIO se obliga a destinar el inmueble exclusivamente para vivienda suya y/o de su grupo familiar autorizado, sin que pueda darle destinación comercial, industrial, turística, hotelera, subarrendarlo, cederlo o permitir su ocupación por terceros no autorizados, salvo autorización previa, expresa y escrita de EL ARRENDADOR.</w:t>
       </w:r>
     </w:p>
     <w:p>
@@ -485,10 +485,17 @@
       </w:pPr>
       <w:r>
         <w:rPr>
-          <w:b w:val="false"/>
-          <w:bCs w:val="false"/>
-        </w:rPr>
-        <w:t xml:space="preserve">Si las partes desean renovar el contrato, podrán hacerlo conforme a la ley y dejando constancia escrita o electrónica de las condiciones aplicables.</w:t>
+          <w:b/>
+          <w:bCs/>
+        </w:rPr>
+        <w:t xml:space="preserve">Prórroga automática (artículo 6 de la Ley 820 de 2003).</w:t>
+      </w:r>
+      <w:r>
+        <w:rPr>
+          <w:b w:val="false"/>
+          <w:bCs w:val="false"/>
+        </w:rPr>
+        <w:t xml:space="preserve"> El presente contrato se entenderá prorrogado en iguales condiciones y por el mismo término inicialmente pactado, siempre que cada una de las partes haya cumplido las obligaciones a su cargo y que EL ARRENDATARIO se avenga a los reajustes del canon autorizados por la ley. En consecuencia, si al vencimiento del término ninguna de las partes manifiesta lo contrario, el contrato continuará prorrogado sin necesidad de suscribir un documento nuevo. La parte que no desee la prórroga deberá dar aviso a la otra por escrito, con una antelación no menor a tres (3) meses al vencimiento, e invocando alguna de las causales legales cuando la ley lo exija.</w:t>
       </w:r>
     </w:p>
     <w:p>
@@ -517,20 +524,40 @@
           <w:b w:val="false"/>
           <w:bCs w:val="false"/>
         </w:rPr>
-        <w:t xml:space="preserve">El canon de arrendamiento solo podrá reajustarse cada doce meses de ejecución del contrato bajo un mismo precio, de conformidad con los límites establecidos por la normatividad colombiana aplicable.</w:t>
-      </w:r>
-    </w:p>
-    <w:p>
-      <w:pPr>
-        <w:spacing w:after="100"/>
-        <w:jc w:val="both"/>
-      </w:pPr>
-      <w:r>
-        <w:rPr>
-          <w:b w:val="false"/>
-          <w:bCs w:val="false"/>
-        </w:rPr>
-        <w:t xml:space="preserve">El incremento no podrá superar el porcentaje legalmente permitido para el periodo correspondiente. ArriendoSeguro podrá servir como herramienta de cálculo y registro del reajuste, sin que ello sustituya la responsabilidad de las partes de verificar la normatividad vigente.</w:t>
+        <w:t xml:space="preserve">El canon de arrendamiento solo podrá reajustarse cada doce (12) meses de ejecución del contrato bajo un mismo precio.</w:t>
+      </w:r>
+    </w:p>
+    <w:p>
+      <w:pPr>
+        <w:spacing w:after="100"/>
+        <w:jc w:val="both"/>
+      </w:pPr>
+      <w:r>
+        <w:rPr>
+          <w:b/>
+          <w:bCs/>
+        </w:rPr>
+        <w:t xml:space="preserve">Límite legal del reajuste (artículo 20 de la Ley 820 de 2003).</w:t>
+      </w:r>
+      <w:r>
+        <w:rPr>
+          <w:b w:val="false"/>
+          <w:bCs w:val="false"/>
+        </w:rPr>
+        <w:t xml:space="preserve"> Conforme al artículo 20 de la Ley 820 de 2003: «Cada doce (12) meses de ejecución del contrato bajo un mismo precio, el arrendador podrá incrementar el canon hasta en una proporción que no sea superior al ciento por ciento (100%) del incremento que haya tenido el índice de precios al consumidor en el año calendario inmediatamente anterior a aquél en que deba efectuarse el reajuste del canon».</w:t>
+      </w:r>
+    </w:p>
+    <w:p>
+      <w:pPr>
+        <w:spacing w:after="100"/>
+        <w:jc w:val="both"/>
+      </w:pPr>
+      <w:r>
+        <w:rPr>
+          <w:b w:val="false"/>
+          <w:bCs w:val="false"/>
+        </w:rPr>
+        <w:t xml:space="preserve">El incremento no podrá superar ese límite. ArriendoSeguro podrá servir como herramienta de cálculo y registro del reajuste, sin que ello sustituya la responsabilidad de las partes de verificar la normatividad vigente.</w:t>
       </w:r>
     </w:p>
     <w:p>
@@ -1030,14 +1057,34 @@
     <w:p>
       <w:pPr>
         <w:spacing w:after="100"/>
-        <w:jc w:val="both"/>
-      </w:pPr>
-      <w:r>
-        <w:rPr>
-          <w:b w:val="false"/>
-          <w:bCs w:val="false"/>
-        </w:rPr>
-        <w:t xml:space="preserve">[CLAUSULA_CODEUDOR — CONDICIONAL: ver Anexo de cláusulas condicionales]</w:t>
+      </w:pPr>
+      <w:r>
+        <w:rPr>
+          <w:color w:val="475569"/>
+          <w:sz w:val="18"/>
+          <w:szCs w:val="18"/>
+        </w:rPr>
+        <w:t xml:space="preserve">(Cuando hay codeudor solidario, la siguiente cláusula se inserta aquí, en el cuerpo del contrato:)</w:t>
+      </w:r>
+    </w:p>
+    <w:p>
+      <w:pPr>
+        <w:spacing w:after="100"/>
+        <w:jc w:val="both"/>
+      </w:pPr>
+      <w:r>
+        <w:rPr>
+          <w:b/>
+          <w:bCs/>
+        </w:rPr>
+        <w:t xml:space="preserve">CLÁUSULA DE CODEUDOR SOLIDARIO.</w:t>
+      </w:r>
+      <w:r>
+        <w:rPr>
+          <w:b w:val="false"/>
+          <w:bCs w:val="false"/>
+        </w:rPr>
+        <w:t xml:space="preserve"> Comparece al presente contrato [NOMBRE_CODEUDOR], mayor de edad, identificado(a) con [TIPO_DOCUMENTO_CODEUDOR] No. [NUMERO_DOCUMENTO_CODEUDOR], domiciliado(a) en [CIUDAD_CODEUDOR], con correo electrónico [EMAIL_CODEUDOR], teléfono [TELEFONO_CODEUDOR] y dirección de notificación [DIRECCION_NOTIFICACION_CODEUDOR], quien para efectos del presente contrato actuará como CODEUDOR SOLIDARIO de EL ARRENDATARIO, obligándose solidariamente con este al cumplimiento de todas las obligaciones derivadas del contrato.</w:t>
       </w:r>
     </w:p>
     <w:p>
@@ -1179,7 +1226,7 @@
           <w:sz w:val="24"/>
           <w:szCs w:val="24"/>
         </w:rPr>
-        <w:t xml:space="preserve">DÉCIMA CUARTA. EVALUACIÓN ESTRUCTURADA DE LA EXPERIENCIA ARRENDATICIA Y REPUTACIÓN</w:t>
+        <w:t xml:space="preserve">DÉCIMA CUARTA. AUTORIZACIÓN VOLUNTARIA DE EVALUACIÓN ESTRUCTURADA Y REPUTACIÓN</w:t>
       </w:r>
     </w:p>
     <w:p>
@@ -1199,41 +1246,55 @@
           <w:b/>
           <w:bCs/>
         </w:rPr>
-        <w:t xml:space="preserve">aceptan y autorizan de forma expresa, libre, previa e informada</w:t>
-      </w:r>
-      <w:r>
-        <w:rPr>
-          <w:b w:val="false"/>
-          <w:bCs w:val="false"/>
-        </w:rPr>
-        <w:t xml:space="preserve"> que, durante la ejecución del contrato y a su terminación, cada parte podrá calificar a la otra mediante una evaluación estructurada de la experiencia arrendaticia, a través de formularios cerrados (calificación por estrellas, sin texto libre difamatorio). La calificación es </w:t>
-      </w:r>
-      <w:r>
-        <w:rPr>
-          <w:b/>
-          <w:bCs/>
-        </w:rPr>
-        <w:t xml:space="preserve">recíproca</w:t>
-      </w:r>
-      <w:r>
-        <w:rPr>
-          <w:b w:val="false"/>
-          <w:bCs w:val="false"/>
-        </w:rPr>
-        <w:t xml:space="preserve">: cada parte consiente ser evaluada por la otra en las mismas condiciones.</w:t>
-      </w:r>
-    </w:p>
-    <w:p>
-      <w:pPr>
-        <w:spacing w:after="100"/>
-        <w:jc w:val="both"/>
-      </w:pPr>
-      <w:r>
-        <w:rPr>
-          <w:b w:val="false"/>
-          <w:bCs w:val="false"/>
-        </w:rPr>
-        <w:t xml:space="preserve">Dicha evaluación constituye tratamiento de datos personales y se autoriza conforme a la Ley 1581 de 2012 y al aviso de privacidad: no constituye lista negra pública ni consulta libre por cédula, solo se mostrará agregada y con autorización del titular, y cada titular podrá conocer, actualizar y rectificar la información y ejercer sus derechos de habeas data.</w:t>
+        <w:t xml:space="preserve">autorizan de forma expresa, libre, previa e informada</w:t>
+      </w:r>
+      <w:r>
+        <w:rPr>
+          <w:b w:val="false"/>
+          <w:bCs w:val="false"/>
+        </w:rPr>
+        <w:t xml:space="preserve"> que, durante la ejecución del contrato y a su terminación, cada parte pueda calificar a la otra mediante una evaluación estructurada de la experiencia (formularios cerrados de calificación por estrellas, sin texto libre difamatorio), de manera recíproca.</w:t>
+      </w:r>
+    </w:p>
+    <w:p>
+      <w:pPr>
+        <w:spacing w:after="100"/>
+        <w:jc w:val="both"/>
+      </w:pPr>
+      <w:r>
+        <w:rPr>
+          <w:b w:val="false"/>
+          <w:bCs w:val="false"/>
+        </w:rPr>
+        <w:t xml:space="preserve">Se deja constancia de que esta evaluación es una </w:t>
+      </w:r>
+      <w:r>
+        <w:rPr>
+          <w:b/>
+          <w:bCs/>
+        </w:rPr>
+        <w:t xml:space="preserve">facultad voluntaria y no una obligación contractual</w:t>
+      </w:r>
+      <w:r>
+        <w:rPr>
+          <w:b w:val="false"/>
+          <w:bCs w:val="false"/>
+        </w:rPr>
+        <w:t xml:space="preserve">: ninguna de las partes está obligada a calificar, y el hecho de calificar o no calificar </w:t>
+      </w:r>
+      <w:r>
+        <w:rPr>
+          <w:b/>
+          <w:bCs/>
+        </w:rPr>
+        <w:t xml:space="preserve">no constituye incumplimiento</w:t>
+      </w:r>
+      <w:r>
+        <w:rPr>
+          <w:b w:val="false"/>
+          <w:bCs w:val="false"/>
+        </w:rPr>
+        <w:t xml:space="preserve"> del presente contrato ni causal de terminación. Constituye tratamiento de datos personales autorizado conforme a la Ley 1581 de 2012 y al aviso de privacidad (no es lista negra pública ni consulta libre por cédula; solo se muestra agregada y con autorización del titular, quien puede conocer, actualizar, rectificar y ejercer sus derechos de habeas data). Su desarrollo detallado hace parte de los anexos de autorización de tratamiento de datos.</w:t>
       </w:r>
     </w:p>
     <w:p>
@@ -1364,6 +1425,32 @@
     </w:p>
     <w:p>
       <w:pPr>
+        <w:spacing w:after="100"/>
+        <w:jc w:val="both"/>
+      </w:pPr>
+      <w:r>
+        <w:rPr>
+          <w:b w:val="false"/>
+          <w:bCs w:val="false"/>
+        </w:rPr>
+        <w:t xml:space="preserve">El presente contrato podrá darse por terminado por las siguientes causas:</w:t>
+      </w:r>
+    </w:p>
+    <w:p>
+      <w:pPr>
+        <w:spacing w:after="100"/>
+        <w:jc w:val="left"/>
+      </w:pPr>
+      <w:r>
+        <w:rPr>
+          <w:b/>
+          <w:bCs/>
+        </w:rPr>
+        <w:t xml:space="preserve">a) Por vencimiento del plazo o por mutuo acuerdo:</w:t>
+      </w:r>
+    </w:p>
+    <w:p>
+      <w:pPr>
         <w:pStyle w:val="ListParagraph"/>
         <w:numPr>
           <w:ilvl w:val="0"/>
@@ -1376,7 +1463,7 @@
           <w:b w:val="false"/>
           <w:bCs w:val="false"/>
         </w:rPr>
-        <w:t xml:space="preserve">Vencimiento del plazo pactado.</w:t>
+        <w:t xml:space="preserve">Por el vencimiento del plazo pactado o de sus prórrogas, dando el aviso previsto en la cláusula CUARTA.</w:t>
       </w:r>
     </w:p>
     <w:p>
@@ -1393,58 +1480,220 @@
           <w:b w:val="false"/>
           <w:bCs w:val="false"/>
         </w:rPr>
-        <w:t xml:space="preserve">Mutuo acuerdo.</w:t>
-      </w:r>
-    </w:p>
-    <w:p>
-      <w:pPr>
-        <w:pStyle w:val="ListParagraph"/>
-        <w:numPr>
-          <w:ilvl w:val="0"/>
-          <w:numId w:val="5"/>
-        </w:numPr>
-        <w:spacing w:after="50"/>
-      </w:pPr>
-      <w:r>
-        <w:rPr>
-          <w:b w:val="false"/>
-          <w:bCs w:val="false"/>
-        </w:rPr>
-        <w:t xml:space="preserve">Incumplimiento de obligaciones legales o contractuales.</w:t>
-      </w:r>
-    </w:p>
-    <w:p>
-      <w:pPr>
-        <w:pStyle w:val="ListParagraph"/>
-        <w:numPr>
-          <w:ilvl w:val="0"/>
-          <w:numId w:val="5"/>
-        </w:numPr>
-        <w:spacing w:after="50"/>
-      </w:pPr>
-      <w:r>
-        <w:rPr>
-          <w:b w:val="false"/>
-          <w:bCs w:val="false"/>
-        </w:rPr>
-        <w:t xml:space="preserve">Causales previstas en normatividad colombiana aplicable.</w:t>
-      </w:r>
-    </w:p>
-    <w:p>
-      <w:pPr>
-        <w:pStyle w:val="ListParagraph"/>
-        <w:numPr>
-          <w:ilvl w:val="0"/>
-          <w:numId w:val="5"/>
-        </w:numPr>
-        <w:spacing w:after="50"/>
-      </w:pPr>
-      <w:r>
-        <w:rPr>
-          <w:b w:val="false"/>
-          <w:bCs w:val="false"/>
-        </w:rPr>
-        <w:t xml:space="preserve">Demás causales reconocidas por la ley.</w:t>
+        <w:t xml:space="preserve">Por mutuo acuerdo escrito entre las partes.</w:t>
+      </w:r>
+    </w:p>
+    <w:p>
+      <w:pPr>
+        <w:spacing w:after="100"/>
+        <w:jc w:val="both"/>
+      </w:pPr>
+      <w:r>
+        <w:rPr>
+          <w:b/>
+          <w:bCs/>
+        </w:rPr>
+        <w:t xml:space="preserve">b) Por incumplimiento imputable a EL ARRENDATARIO (artículo 22 de la Ley 820 de 2003):</w:t>
+      </w:r>
+      <w:r>
+        <w:rPr>
+          <w:b w:val="false"/>
+          <w:bCs w:val="false"/>
+        </w:rPr>
+        <w:t xml:space="preserve"> EL ARRENDADOR podrá dar por terminado unilateralmente el contrato, entre otras, por las siguientes causales:</w:t>
+      </w:r>
+    </w:p>
+    <w:p>
+      <w:pPr>
+        <w:pStyle w:val="ListParagraph"/>
+        <w:numPr>
+          <w:ilvl w:val="0"/>
+          <w:numId w:val="6"/>
+        </w:numPr>
+        <w:spacing w:after="50"/>
+      </w:pPr>
+      <w:r>
+        <w:rPr>
+          <w:b w:val="false"/>
+          <w:bCs w:val="false"/>
+        </w:rPr>
+        <w:t xml:space="preserve">El no pago del canon dentro del término estipulado.</w:t>
+      </w:r>
+    </w:p>
+    <w:p>
+      <w:pPr>
+        <w:pStyle w:val="ListParagraph"/>
+        <w:numPr>
+          <w:ilvl w:val="0"/>
+          <w:numId w:val="6"/>
+        </w:numPr>
+        <w:spacing w:after="50"/>
+      </w:pPr>
+      <w:r>
+        <w:rPr>
+          <w:b w:val="false"/>
+          <w:bCs w:val="false"/>
+        </w:rPr>
+        <w:t xml:space="preserve">El no pago de los servicios públicos, cuando ello dé lugar a la desconexión o pérdida del servicio, o el no pago de las expensas comunes cuando su pago estuviere a cargo de EL ARRENDATARIO.</w:t>
+      </w:r>
+    </w:p>
+    <w:p>
+      <w:pPr>
+        <w:pStyle w:val="ListParagraph"/>
+        <w:numPr>
+          <w:ilvl w:val="0"/>
+          <w:numId w:val="6"/>
+        </w:numPr>
+        <w:spacing w:after="50"/>
+      </w:pPr>
+      <w:r>
+        <w:rPr>
+          <w:b w:val="false"/>
+          <w:bCs w:val="false"/>
+        </w:rPr>
+        <w:t xml:space="preserve">El subarriendo total o parcial del inmueble, la cesión del contrato o del goce del inmueble, o el cambio de destinación, sin autorización expresa y escrita de EL ARRENDADOR.</w:t>
+      </w:r>
+    </w:p>
+    <w:p>
+      <w:pPr>
+        <w:pStyle w:val="ListParagraph"/>
+        <w:numPr>
+          <w:ilvl w:val="0"/>
+          <w:numId w:val="6"/>
+        </w:numPr>
+        <w:spacing w:after="50"/>
+      </w:pPr>
+      <w:r>
+        <w:rPr>
+          <w:b w:val="false"/>
+          <w:bCs w:val="false"/>
+        </w:rPr>
+        <w:t xml:space="preserve">La incursión reiterada en procederes que afecten la tranquilidad ciudadana de los vecinos, o la destinación del inmueble para actos delictivos o que impliquen contravención.</w:t>
+      </w:r>
+    </w:p>
+    <w:p>
+      <w:pPr>
+        <w:pStyle w:val="ListParagraph"/>
+        <w:numPr>
+          <w:ilvl w:val="0"/>
+          <w:numId w:val="6"/>
+        </w:numPr>
+        <w:spacing w:after="50"/>
+      </w:pPr>
+      <w:r>
+        <w:rPr>
+          <w:b w:val="false"/>
+          <w:bCs w:val="false"/>
+        </w:rPr>
+        <w:t xml:space="preserve">La realización de mejoras, cambios o ampliaciones del inmueble sin autorización de EL ARRENDADOR, o la destrucción total o parcial del inmueble o del área arrendada.</w:t>
+      </w:r>
+    </w:p>
+    <w:p>
+      <w:pPr>
+        <w:pStyle w:val="ListParagraph"/>
+        <w:numPr>
+          <w:ilvl w:val="0"/>
+          <w:numId w:val="6"/>
+        </w:numPr>
+        <w:spacing w:after="50"/>
+      </w:pPr>
+      <w:r>
+        <w:rPr>
+          <w:b w:val="false"/>
+          <w:bCs w:val="false"/>
+        </w:rPr>
+        <w:t xml:space="preserve">La violación de las normas del reglamento de propiedad horizontal, cuando aplique.</w:t>
+      </w:r>
+    </w:p>
+    <w:p>
+      <w:pPr>
+        <w:spacing w:after="100"/>
+        <w:jc w:val="both"/>
+      </w:pPr>
+      <w:r>
+        <w:rPr>
+          <w:b/>
+          <w:bCs/>
+        </w:rPr>
+        <w:t xml:space="preserve">c) Por incumplimiento imputable a EL ARRENDADOR (artículo 24 de la Ley 820 de 2003):</w:t>
+      </w:r>
+      <w:r>
+        <w:rPr>
+          <w:b w:val="false"/>
+          <w:bCs w:val="false"/>
+        </w:rPr>
+        <w:t xml:space="preserve"> EL ARRENDATARIO podrá dar por terminado unilateralmente el contrato, entre otras, por las siguientes causales:</w:t>
+      </w:r>
+    </w:p>
+    <w:p>
+      <w:pPr>
+        <w:pStyle w:val="ListParagraph"/>
+        <w:numPr>
+          <w:ilvl w:val="0"/>
+          <w:numId w:val="7"/>
+        </w:numPr>
+        <w:spacing w:after="50"/>
+      </w:pPr>
+      <w:r>
+        <w:rPr>
+          <w:b w:val="false"/>
+          <w:bCs w:val="false"/>
+        </w:rPr>
+        <w:t xml:space="preserve">La suspensión de la prestación de los servicios públicos al inmueble por acción premeditada de EL ARRENDADOR, o por no pagar los que estuvieren a su cargo.</w:t>
+      </w:r>
+    </w:p>
+    <w:p>
+      <w:pPr>
+        <w:pStyle w:val="ListParagraph"/>
+        <w:numPr>
+          <w:ilvl w:val="0"/>
+          <w:numId w:val="7"/>
+        </w:numPr>
+        <w:spacing w:after="50"/>
+      </w:pPr>
+      <w:r>
+        <w:rPr>
+          <w:b w:val="false"/>
+          <w:bCs w:val="false"/>
+        </w:rPr>
+        <w:t xml:space="preserve">La incursión reiterada de EL ARRENDADOR en procederes que afecten gravemente el disfrute cabal del inmueble por EL ARRENDATARIO.</w:t>
+      </w:r>
+    </w:p>
+    <w:p>
+      <w:pPr>
+        <w:pStyle w:val="ListParagraph"/>
+        <w:numPr>
+          <w:ilvl w:val="0"/>
+          <w:numId w:val="7"/>
+        </w:numPr>
+        <w:spacing w:after="50"/>
+      </w:pPr>
+      <w:r>
+        <w:rPr>
+          <w:b w:val="false"/>
+          <w:bCs w:val="false"/>
+        </w:rPr>
+        <w:t xml:space="preserve">El desconocimiento por parte de EL ARRENDADOR de los derechos que la ley o el contrato reconocen a EL ARRENDATARIO.</w:t>
+      </w:r>
+    </w:p>
+    <w:p>
+      <w:pPr>
+        <w:spacing w:after="100"/>
+        <w:jc w:val="both"/>
+      </w:pPr>
+      <w:r>
+        <w:rPr>
+          <w:b/>
+          <w:bCs/>
+        </w:rPr>
+        <w:t xml:space="preserve">d) Terminación unilateral con preaviso e indemnización (artículos 22 y 24 de la Ley 820 de 2003):</w:t>
+      </w:r>
+      <w:r>
+        <w:rPr>
+          <w:b w:val="false"/>
+          <w:bCs w:val="false"/>
+        </w:rPr>
+        <w:t xml:space="preserve"> cualquiera de las partes podrá darla por terminada unilateralmente a la fecha de vencimiento o de sus prórrogas, dando aviso escrito a la otra con no menos de tres (3) meses de antelación y, cuando la ley lo exija, pagando la indemnización equivalente prevista en la ley.</w:t>
       </w:r>
     </w:p>
     <w:p>
@@ -1739,154 +1988,6 @@
     </w:p>
     <w:p>
       <w:pPr>
-        <w:pStyle w:val="Heading2"/>
-        <w:spacing w:before="200" w:after="90"/>
-      </w:pPr>
-      <w:r>
-        <w:rPr>
-          <w:b/>
-          <w:bCs/>
-          <w:color w:val="5B21B6"/>
-          <w:sz w:val="24"/>
-          <w:szCs w:val="24"/>
-        </w:rPr>
-        <w:t xml:space="preserve">A) Codeudor solidario (cuando existe uno o más)</w:t>
-      </w:r>
-    </w:p>
-    <w:p>
-      <w:pPr>
-        <w:pStyle w:val="Heading3"/>
-        <w:spacing w:before="150" w:after="70"/>
-      </w:pPr>
-      <w:r>
-        <w:rPr>
-          <w:b/>
-          <w:bCs/>
-          <w:color w:val="334155"/>
-          <w:sz w:val="21"/>
-          <w:szCs w:val="21"/>
-        </w:rPr>
-        <w:t xml:space="preserve">Comparecencia (encabezado del contrato)</w:t>
-      </w:r>
-    </w:p>
-    <w:p>
-      <w:pPr>
-        <w:spacing w:after="100"/>
-        <w:jc w:val="both"/>
-      </w:pPr>
-      <w:r>
-        <w:rPr>
-          <w:b w:val="false"/>
-          <w:bCs w:val="false"/>
-        </w:rPr>
-        <w:t xml:space="preserve">y [NOMBRE_CODEUDOR], mayor de edad, identificado(a) con [TIPO_DOCUMENTO_CODEUDOR] No. [NUMERO_DOCUMENTO_CODEUDOR], domiciliado(a) en [CIUDAD_CODEUDOR], con correo electrónico [EMAIL_CODEUDOR], teléfono [TELEFONO_CODEUDOR] y dirección de notificación [DIRECCION_NOTIFICACION_CODEUDOR], quien para efectos del presente contrato se denominará EL CODEUDOR SOLIDARIO;</w:t>
-      </w:r>
-    </w:p>
-    <w:p>
-      <w:pPr>
-        <w:pStyle w:val="Heading3"/>
-        <w:spacing w:before="150" w:after="70"/>
-      </w:pPr>
-      <w:r>
-        <w:rPr>
-          <w:b/>
-          <w:bCs/>
-          <w:color w:val="334155"/>
-          <w:sz w:val="21"/>
-          <w:szCs w:val="21"/>
-        </w:rPr>
-        <w:t xml:space="preserve">Cláusula de codeudor solidario</w:t>
-      </w:r>
-    </w:p>
-    <w:p>
-      <w:pPr>
-        <w:spacing w:after="100"/>
-        <w:jc w:val="both"/>
-      </w:pPr>
-      <w:r>
-        <w:rPr>
-          <w:b w:val="false"/>
-          <w:bCs w:val="false"/>
-        </w:rPr>
-        <w:t xml:space="preserve">CLÁUSULA DE CODEUDOR SOLIDARIO. Comparece al presente contrato [NOMBRE_CODEUDOR], mayor de edad, identificado(a) con [TIPO_DOCUMENTO_CODEUDOR] No. [NUMERO_DOCUMENTO_CODEUDOR], domiciliado(a) en [CIUDAD_CODEUDOR], con correo electrónico [EMAIL_CODEUDOR], teléfono [TELEFONO_CODEUDOR] y dirección de notificación [DIRECCION_NOTIFICACION_CODEUDOR], quien para efectos del presente contrato actuará como CODEUDOR SOLIDARIO de EL ARRENDATARIO.</w:t>
-      </w:r>
-    </w:p>
-    <w:p>
-      <w:pPr>
-        <w:pStyle w:val="Heading3"/>
-        <w:spacing w:before="150" w:after="70"/>
-      </w:pPr>
-      <w:r>
-        <w:rPr>
-          <w:b/>
-          <w:bCs/>
-          <w:color w:val="334155"/>
-          <w:sz w:val="21"/>
-          <w:szCs w:val="21"/>
-        </w:rPr>
-        <w:t xml:space="preserve">Notificaciones del codeudor</w:t>
-      </w:r>
-    </w:p>
-    <w:p>
-      <w:pPr>
-        <w:spacing w:after="100"/>
-        <w:jc w:val="left"/>
-      </w:pPr>
-      <w:r>
-        <w:rPr>
-          <w:b w:val="false"/>
-          <w:bCs w:val="false"/>
-        </w:rPr>
-        <w:t xml:space="preserve">EL CODEUDOR SOLIDARIO: Dirección: [DIRECCION_NOTIFICACION_CODEUDOR] · Correo: [EMAIL_CODEUDOR]</w:t>
-      </w:r>
-    </w:p>
-    <w:p>
-      <w:pPr>
-        <w:pStyle w:val="Heading3"/>
-        <w:spacing w:before="150" w:after="70"/>
-      </w:pPr>
-      <w:r>
-        <w:rPr>
-          <w:b/>
-          <w:bCs/>
-          <w:color w:val="334155"/>
-          <w:sz w:val="21"/>
-          <w:szCs w:val="21"/>
-        </w:rPr>
-        <w:t xml:space="preserve">Firma del codeudor</w:t>
-      </w:r>
-    </w:p>
-    <w:p>
-      <w:pPr>
-        <w:spacing w:after="100"/>
-        <w:jc w:val="left"/>
-      </w:pPr>
-      <w:r>
-        <w:rPr>
-          <w:b w:val="false"/>
-          <w:bCs w:val="false"/>
-        </w:rPr>
-        <w:t xml:space="preserve">EL CODEUDOR SOLIDARIO: Nombre: [NOMBRE_CODEUDOR] · Documento: [DOCUMENTO_CODEUDOR]</w:t>
-      </w:r>
-    </w:p>
-    <w:p>
-      <w:pPr>
-        <w:pStyle w:val="Heading2"/>
-        <w:spacing w:before="200" w:after="90"/>
-      </w:pPr>
-      <w:r>
-        <w:rPr>
-          <w:b/>
-          <w:bCs/>
-          <w:color w:val="5B21B6"/>
-          <w:sz w:val="24"/>
-          <w:szCs w:val="24"/>
-        </w:rPr>
-        <w:t xml:space="preserve">B) Garantía para servicios públicos (Artículo 15, Ley 820 de 2003)</w:t>
-      </w:r>
-    </w:p>
-    <w:p>
-      <w:pPr>
         <w:spacing w:after="100"/>
       </w:pPr>
       <w:r>
@@ -1895,49 +1996,23 @@
           <w:sz w:val="18"/>
           <w:szCs w:val="18"/>
         </w:rPr>
-        <w:t xml:space="preserve">Se imprime solo si las partes la habilitan y pactan un valor (máximo: dos períodos de facturación).</w:t>
-      </w:r>
-    </w:p>
-    <w:p>
-      <w:pPr>
-        <w:spacing w:after="100"/>
-        <w:jc w:val="both"/>
-      </w:pPr>
-      <w:r>
-        <w:rPr>
-          <w:b w:val="false"/>
-          <w:bCs w:val="false"/>
-        </w:rPr>
-        <w:t xml:space="preserve">Las partes pactan, de manera exclusiva para garantizar el pago de los servicios públicos domiciliarios del inmueble, una garantía a cargo de EL ARRENDATARIO por valor de [VALOR_ACORDADO], suma que no excede el valor de los dos (2) últimos períodos de facturación de dichos servicios (máximo legal: [VALOR_MÁXIMO]).</w:t>
-      </w:r>
-    </w:p>
-    <w:p>
-      <w:pPr>
-        <w:spacing w:after="100"/>
-        <w:jc w:val="both"/>
-      </w:pPr>
-      <w:r>
-        <w:rPr>
-          <w:b w:val="false"/>
-          <w:bCs w:val="false"/>
-        </w:rPr>
-        <w:t xml:space="preserve">Esta garantía se establece por excepción, al amparo del artículo 15 de la Ley 820 de 2003; se destina únicamente a cubrir obligaciones derivadas de los servicios públicos del inmueble y no constituye depósito en dinero ni caución real prohibida por el artículo 16 de la misma ley. Verificado el pago de dichos servicios a la terminación del contrato, la garantía se devolverá o aplicará conforme a la ley.</w:t>
-      </w:r>
-    </w:p>
-    <w:p>
-      <w:pPr>
-        <w:pStyle w:val="Heading2"/>
-        <w:spacing w:before="200" w:after="90"/>
-      </w:pPr>
-      <w:r>
-        <w:rPr>
-          <w:b/>
-          <w:bCs/>
-          <w:color w:val="5B21B6"/>
-          <w:sz w:val="24"/>
-          <w:szCs w:val="24"/>
-        </w:rPr>
-        <w:t xml:space="preserve">C) Comprobantes de pago y notificaciones</w:t>
+        <w:t xml:space="preserve">Nota: el CODEUDOR SOLIDARIO NO va en anexo. Su comparecencia, cláusula, notificaciones y firma se insertan en el CUERPO del contrato (comparecencia inicial, cláusula tras la DÉCIMA PRIMERA, notificaciones en la DÉCIMA QUINTA y firma en la ACEPTACIÓN), por ser parte del contrato.</w:t>
+      </w:r>
+    </w:p>
+    <w:p>
+      <w:pPr>
+        <w:pStyle w:val="Heading2"/>
+        <w:spacing w:before="200" w:after="90"/>
+      </w:pPr>
+      <w:r>
+        <w:rPr>
+          <w:b/>
+          <w:bCs/>
+          <w:color w:val="5B21B6"/>
+          <w:sz w:val="24"/>
+          <w:szCs w:val="24"/>
+        </w:rPr>
+        <w:t xml:space="preserve">A) Garantía para servicios públicos (Artículo 15, Ley 820 de 2003)</w:t>
       </w:r>
     </w:p>
     <w:p>
@@ -1950,20 +2025,49 @@
           <w:sz w:val="18"/>
           <w:szCs w:val="18"/>
         </w:rPr>
-        <w:t xml:space="preserve">Se imprime solo si el dueño eligió, antes de firmar, la política de subir comprobantes.</w:t>
-      </w:r>
-    </w:p>
-    <w:p>
-      <w:pPr>
-        <w:spacing w:after="100"/>
-        <w:jc w:val="both"/>
-      </w:pPr>
-      <w:r>
-        <w:rPr>
-          <w:b w:val="false"/>
-          <w:bCs w:val="false"/>
-        </w:rPr>
-        <w:t xml:space="preserve">EL ARRENDATARIO registrará en la plataforma ArriendoSeguro el comprobante de cada pago del canon dentro de los días siguientes a la fecha pactada. La plataforma enviará recordatorios a EL ARRENDATARIO y, de no registrarse el comprobante en el plazo, podrá enviarlos también a EL/LOS CODEUDOR(ES) solidario(s), conforme al protocolo informado a las partes. Este registro es un mecanismo de constancia y comunicación entre las partes; no sustituye los medios de pago ni las obligaciones legales del contrato, y su omisión no exonera del pago del canon. Ante controversias, las partes podrán registrar una conciliación en la plataforma. En lo no previsto aquí, primará la Ley 820 de 2003 y demás normas concordantes.</w:t>
+        <w:t xml:space="preserve">Se imprime solo si las partes la habilitan y pactan un valor (máximo: dos períodos de facturación).</w:t>
+      </w:r>
+    </w:p>
+    <w:p>
+      <w:pPr>
+        <w:spacing w:after="100"/>
+        <w:jc w:val="both"/>
+      </w:pPr>
+      <w:r>
+        <w:rPr>
+          <w:b w:val="false"/>
+          <w:bCs w:val="false"/>
+        </w:rPr>
+        <w:t xml:space="preserve">Las partes pactan, de manera exclusiva para garantizar el pago de los servicios públicos domiciliarios del inmueble, una garantía a cargo de EL ARRENDATARIO por valor de [VALOR_ACORDADO], suma que no excede el valor de los dos (2) últimos períodos de facturación de dichos servicios (máximo legal: [VALOR_MÁXIMO]).</w:t>
+      </w:r>
+    </w:p>
+    <w:p>
+      <w:pPr>
+        <w:spacing w:after="100"/>
+        <w:jc w:val="both"/>
+      </w:pPr>
+      <w:r>
+        <w:rPr>
+          <w:b w:val="false"/>
+          <w:bCs w:val="false"/>
+        </w:rPr>
+        <w:t xml:space="preserve">Esta garantía se establece por excepción, al amparo del artículo 15 de la Ley 820 de 2003; se destina únicamente a cubrir obligaciones derivadas de los servicios públicos del inmueble y no constituye depósito en dinero ni caución real prohibida por el artículo 16 de la misma ley. Verificado el pago de dichos servicios a la terminación del contrato, la garantía se devolverá o aplicará conforme a la ley.</w:t>
+      </w:r>
+    </w:p>
+    <w:p>
+      <w:pPr>
+        <w:pStyle w:val="Heading2"/>
+        <w:spacing w:before="200" w:after="90"/>
+      </w:pPr>
+      <w:r>
+        <w:rPr>
+          <w:b/>
+          <w:bCs/>
+          <w:color w:val="5B21B6"/>
+          <w:sz w:val="24"/>
+          <w:szCs w:val="24"/>
+        </w:rPr>
+        <w:t xml:space="preserve">B) Comprobantes de pago y notificaciones</w:t>
       </w:r>
     </w:p>
     <w:p>
@@ -1976,6 +2080,32 @@
           <w:sz w:val="18"/>
           <w:szCs w:val="18"/>
         </w:rPr>
+        <w:t xml:space="preserve">Se imprime solo si el dueño eligió, antes de firmar, la política de subir comprobantes.</w:t>
+      </w:r>
+    </w:p>
+    <w:p>
+      <w:pPr>
+        <w:spacing w:after="100"/>
+        <w:jc w:val="both"/>
+      </w:pPr>
+      <w:r>
+        <w:rPr>
+          <w:b w:val="false"/>
+          <w:bCs w:val="false"/>
+        </w:rPr>
+        <w:t xml:space="preserve">EL ARRENDATARIO registrará en la plataforma ArriendoSeguro el comprobante de cada pago del canon dentro de los días siguientes a la fecha pactada. La plataforma enviará recordatorios a EL ARRENDATARIO y, de no registrarse el comprobante en el plazo, podrá enviarlos también a EL/LOS CODEUDOR(ES) solidario(s), conforme al protocolo informado a las partes. Este registro es un mecanismo de constancia y comunicación entre las partes; no sustituye los medios de pago ni las obligaciones legales del contrato, y su omisión no exonera del pago del canon. Ante controversias, las partes podrán registrar una conciliación en la plataforma. En lo no previsto aquí, primará la Ley 820 de 2003 y demás normas concordantes.</w:t>
+      </w:r>
+    </w:p>
+    <w:p>
+      <w:pPr>
+        <w:spacing w:after="100"/>
+      </w:pPr>
+      <w:r>
+        <w:rPr>
+          <w:color w:val="475569"/>
+          <w:sz w:val="18"/>
+          <w:szCs w:val="18"/>
+        </w:rPr>
         <w:t xml:space="preserve">Cláusula operativa acordada voluntariamente por las partes; su validez se sujeta a la normatividad colombiana aplicable.</w:t>
       </w:r>
     </w:p>
@@ -1992,7 +2122,7 @@
           <w:sz w:val="24"/>
           <w:szCs w:val="24"/>
         </w:rPr>
-        <w:t xml:space="preserve">D) Observaciones y acuerdos complementarios</w:t>
+        <w:t xml:space="preserve">C) Observaciones y acuerdos complementarios</w:t>
       </w:r>
     </w:p>
     <w:p>
@@ -2380,7 +2510,7 @@
           <w:b w:val="false"/>
           <w:bCs w:val="false"/>
         </w:rPr>
-        <w:t xml:space="preserve">«La presente cláusula adicional refleja un acuerdo voluntario entre las partes y su validez se encuentra sujeta a la normatividad colombiana aplicable. En caso de contradicción con la ley imperativa, primarán las normas legales.»</w:t>
+        <w:t xml:space="preserve">«La presente cláusula adicional refleja un acuerdo voluntario entre las partes. Las estipulaciones que las partes adicionen no podrán ser contrarias a la Constitución Política ni a la ley; de serlo, se tendrán por no escritas o serán nulas, sin que ello afecte la validez de las demás cláusulas del contrato. En caso de contradicción con la ley imperativa, primarán las normas legales.»</w:t>
       </w:r>
     </w:p>
     <w:p>
@@ -6063,7 +6193,7 @@
         <w:pStyle w:val="ListParagraph"/>
         <w:numPr>
           <w:ilvl w:val="0"/>
-          <w:numId w:val="6"/>
+          <w:numId w:val="8"/>
         </w:numPr>
         <w:spacing w:after="50"/>
       </w:pPr>
@@ -6080,7 +6210,7 @@
         <w:pStyle w:val="ListParagraph"/>
         <w:numPr>
           <w:ilvl w:val="0"/>
-          <w:numId w:val="6"/>
+          <w:numId w:val="8"/>
         </w:numPr>
         <w:spacing w:after="50"/>
       </w:pPr>
@@ -6097,7 +6227,7 @@
         <w:pStyle w:val="ListParagraph"/>
         <w:numPr>
           <w:ilvl w:val="0"/>
-          <w:numId w:val="6"/>
+          <w:numId w:val="8"/>
         </w:numPr>
         <w:spacing w:after="50"/>
       </w:pPr>
@@ -6114,7 +6244,7 @@
         <w:pStyle w:val="ListParagraph"/>
         <w:numPr>
           <w:ilvl w:val="0"/>
-          <w:numId w:val="6"/>
+          <w:numId w:val="8"/>
         </w:numPr>
         <w:spacing w:after="50"/>
       </w:pPr>
@@ -6131,7 +6261,7 @@
         <w:pStyle w:val="ListParagraph"/>
         <w:numPr>
           <w:ilvl w:val="0"/>
-          <w:numId w:val="6"/>
+          <w:numId w:val="8"/>
         </w:numPr>
         <w:spacing w:after="50"/>
       </w:pPr>
@@ -6148,7 +6278,7 @@
         <w:pStyle w:val="ListParagraph"/>
         <w:numPr>
           <w:ilvl w:val="0"/>
-          <w:numId w:val="6"/>
+          <w:numId w:val="8"/>
         </w:numPr>
         <w:spacing w:after="50"/>
       </w:pPr>
@@ -7277,7 +7407,7 @@
         <w:pStyle w:val="ListParagraph"/>
         <w:numPr>
           <w:ilvl w:val="0"/>
-          <w:numId w:val="7"/>
+          <w:numId w:val="9"/>
         </w:numPr>
         <w:spacing w:after="50"/>
       </w:pPr>
@@ -7294,7 +7424,7 @@
         <w:pStyle w:val="ListParagraph"/>
         <w:numPr>
           <w:ilvl w:val="0"/>
-          <w:numId w:val="7"/>
+          <w:numId w:val="9"/>
         </w:numPr>
         <w:spacing w:after="50"/>
       </w:pPr>
@@ -7311,7 +7441,7 @@
         <w:pStyle w:val="ListParagraph"/>
         <w:numPr>
           <w:ilvl w:val="0"/>
-          <w:numId w:val="7"/>
+          <w:numId w:val="9"/>
         </w:numPr>
         <w:spacing w:after="50"/>
       </w:pPr>
@@ -7328,7 +7458,7 @@
         <w:pStyle w:val="ListParagraph"/>
         <w:numPr>
           <w:ilvl w:val="0"/>
-          <w:numId w:val="7"/>
+          <w:numId w:val="9"/>
         </w:numPr>
         <w:spacing w:after="50"/>
       </w:pPr>
@@ -7345,7 +7475,7 @@
         <w:pStyle w:val="ListParagraph"/>
         <w:numPr>
           <w:ilvl w:val="0"/>
-          <w:numId w:val="7"/>
+          <w:numId w:val="9"/>
         </w:numPr>
         <w:spacing w:after="50"/>
       </w:pPr>
@@ -7415,7 +7545,7 @@
         <w:pStyle w:val="ListParagraph"/>
         <w:numPr>
           <w:ilvl w:val="0"/>
-          <w:numId w:val="8"/>
+          <w:numId w:val="10"/>
         </w:numPr>
         <w:spacing w:after="50"/>
       </w:pPr>
@@ -7439,7 +7569,7 @@
         <w:pStyle w:val="ListParagraph"/>
         <w:numPr>
           <w:ilvl w:val="0"/>
-          <w:numId w:val="8"/>
+          <w:numId w:val="10"/>
         </w:numPr>
         <w:spacing w:after="50"/>
       </w:pPr>
@@ -7463,7 +7593,7 @@
         <w:pStyle w:val="ListParagraph"/>
         <w:numPr>
           <w:ilvl w:val="0"/>
-          <w:numId w:val="8"/>
+          <w:numId w:val="10"/>
         </w:numPr>
         <w:spacing w:after="50"/>
       </w:pPr>
@@ -7487,7 +7617,7 @@
         <w:pStyle w:val="ListParagraph"/>
         <w:numPr>
           <w:ilvl w:val="0"/>
-          <w:numId w:val="8"/>
+          <w:numId w:val="10"/>
         </w:numPr>
         <w:spacing w:after="50"/>
       </w:pPr>
@@ -7511,7 +7641,7 @@
         <w:pStyle w:val="ListParagraph"/>
         <w:numPr>
           <w:ilvl w:val="0"/>
-          <w:numId w:val="8"/>
+          <w:numId w:val="10"/>
         </w:numPr>
         <w:spacing w:after="50"/>
       </w:pPr>
@@ -7535,7 +7665,7 @@
         <w:pStyle w:val="ListParagraph"/>
         <w:numPr>
           <w:ilvl w:val="0"/>
-          <w:numId w:val="8"/>
+          <w:numId w:val="10"/>
         </w:numPr>
         <w:spacing w:after="50"/>
       </w:pPr>
@@ -7559,7 +7689,7 @@
         <w:pStyle w:val="ListParagraph"/>
         <w:numPr>
           <w:ilvl w:val="0"/>
-          <w:numId w:val="8"/>
+          <w:numId w:val="10"/>
         </w:numPr>
         <w:spacing w:after="50"/>
       </w:pPr>
@@ -7583,7 +7713,7 @@
         <w:pStyle w:val="ListParagraph"/>
         <w:numPr>
           <w:ilvl w:val="0"/>
-          <w:numId w:val="8"/>
+          <w:numId w:val="10"/>
         </w:numPr>
         <w:spacing w:after="50"/>
       </w:pPr>
@@ -7812,6 +7942,30 @@
     </w:lvl>
   </w:abstractNum>
   <w:abstractNum w:abstractNumId="8" w15:restartNumberingAfterBreak="0">
+    <w:multiLevelType w:val="hybridMultilevel"/>
+    <w:lvl w:ilvl="0" w15:tentative="1">
+      <w:start w:val="1"/>
+      <w:numFmt w:val="decimal"/>
+      <w:lvlText w:val="%1."/>
+      <w:lvlJc w:val="left"/>
+      <w:pPr>
+        <w:ind w:left="460" w:hanging="260"/>
+      </w:pPr>
+    </w:lvl>
+  </w:abstractNum>
+  <w:abstractNum w:abstractNumId="9" w15:restartNumberingAfterBreak="0">
+    <w:multiLevelType w:val="hybridMultilevel"/>
+    <w:lvl w:ilvl="0" w15:tentative="1">
+      <w:start w:val="1"/>
+      <w:numFmt w:val="decimal"/>
+      <w:lvlText w:val="%1."/>
+      <w:lvlJc w:val="left"/>
+      <w:pPr>
+        <w:ind w:left="460" w:hanging="260"/>
+      </w:pPr>
+    </w:lvl>
+  </w:abstractNum>
+  <w:abstractNum w:abstractNumId="10" w15:restartNumberingAfterBreak="0">
     <w:multiLevelType w:val="hybridMultilevel"/>
     <w:lvl w:ilvl="0" w15:tentative="1">
       <w:start w:val="1"/>
@@ -7867,6 +8021,18 @@
   </w:num>
   <w:num w:numId="8">
     <w:abstractNumId w:val="8"/>
+    <w:lvlOverride w:ilvl="0">
+      <w:startOverride w:val="1"/>
+    </w:lvlOverride>
+  </w:num>
+  <w:num w:numId="9">
+    <w:abstractNumId w:val="9"/>
+    <w:lvlOverride w:ilvl="0">
+      <w:startOverride w:val="1"/>
+    </w:lvlOverride>
+  </w:num>
+  <w:num w:numId="10">
+    <w:abstractNumId w:val="10"/>
     <w:lvlOverride w:ilvl="0">
       <w:startOverride w:val="1"/>
     </w:lvlOverride>

</xml_diff>